<commit_message>
feat: hybrid search, audit logging, streaming responses (SSE)
</commit_message>
<xml_diff>
--- a/docs/development-report.docx
+++ b/docs/development-report.docx
@@ -11,16 +11,22 @@
       </w:r>
     </w:p>
     <w:p>
+      <w:r>
+        <w:t>最終更新: 2026年5月30日</w:t>
+      </w:r>
+    </w:p>
+    <w:p/>
+    <w:p>
       <w:pPr>
         <w:pStyle w:val="Heading1"/>
       </w:pPr>
       <w:r>
-        <w:t>概要</w:t>
+        <w:t>1. 概要</w:t>
       </w:r>
     </w:p>
     <w:p>
       <w:r>
-        <w:t>PDF・Wordファイルをアップロードし、その内容に基づいてチャット形式で質問に回答するRAG（Retrieval-Augmented Generation）アプリケーションを開発・デプロイしました。</w:t>
+        <w:t>PDF・Word・Excel・PowerPoint・CSV・テキストファイルをアップロードし、その内容に基づいてチャット形式で質問に回答するRAG（Retrieval-Augmented Generation）アプリケーション。社内業務マニュアルや帳票を複数人で共有し、繰り返し利用することを想定している。</w:t>
       </w:r>
     </w:p>
     <w:p>
@@ -28,7 +34,7 @@
         <w:pStyle w:val="Heading1"/>
       </w:pPr>
       <w:r>
-        <w:t>技術スタック</w:t>
+        <w:t>2. 技術スタック</w:t>
       </w:r>
     </w:p>
     <w:tbl>
@@ -92,7 +98,7 @@
           </w:tcPr>
           <w:p>
             <w:r>
-              <w:t>LLM</w:t>
+              <w:t>LLM (回答生成)</w:t>
             </w:r>
           </w:p>
         </w:tc>
@@ -114,7 +120,7 @@
           </w:tcPr>
           <w:p>
             <w:r>
-              <w:t>テキスト検索</w:t>
+              <w:t>埋め込み (検索)</w:t>
             </w:r>
           </w:p>
         </w:tc>
@@ -124,7 +130,73 @@
           </w:tcPr>
           <w:p>
             <w:r>
-              <w:t>TF-IDF (Pure Python実装)</w:t>
+              <w:t>Amazon Bedrock Titan Text Embeddings V2 (256次元)</w:t>
+            </w:r>
+          </w:p>
+        </w:tc>
+      </w:tr>
+      <w:tr>
+        <w:tc>
+          <w:tcPr>
+            <w:tcW w:type="dxa" w:w="4320"/>
+          </w:tcPr>
+          <w:p>
+            <w:r>
+              <w:t>ベクトル検索</w:t>
+            </w:r>
+          </w:p>
+        </w:tc>
+        <w:tc>
+          <w:tcPr>
+            <w:tcW w:type="dxa" w:w="4320"/>
+          </w:tcPr>
+          <w:p>
+            <w:r>
+              <w:t>コサイン類似度 (Pure Python)</w:t>
+            </w:r>
+          </w:p>
+        </w:tc>
+      </w:tr>
+      <w:tr>
+        <w:tc>
+          <w:tcPr>
+            <w:tcW w:type="dxa" w:w="4320"/>
+          </w:tcPr>
+          <w:p>
+            <w:r>
+              <w:t>ナレッジ永続化</w:t>
+            </w:r>
+          </w:p>
+        </w:tc>
+        <w:tc>
+          <w:tcPr>
+            <w:tcW w:type="dxa" w:w="4320"/>
+          </w:tcPr>
+          <w:p>
+            <w:r>
+              <w:t>Amazon S3</w:t>
+            </w:r>
+          </w:p>
+        </w:tc>
+      </w:tr>
+      <w:tr>
+        <w:tc>
+          <w:tcPr>
+            <w:tcW w:type="dxa" w:w="4320"/>
+          </w:tcPr>
+          <w:p>
+            <w:r>
+              <w:t>認証</w:t>
+            </w:r>
+          </w:p>
+        </w:tc>
+        <w:tc>
+          <w:tcPr>
+            <w:tcW w:type="dxa" w:w="4320"/>
+          </w:tcPr>
+          <w:p>
+            <w:r>
+              <w:t>Amazon Cognito User Pool</w:t>
             </w:r>
           </w:p>
         </w:tc>
@@ -146,29 +218,7 @@
           </w:tcPr>
           <w:p>
             <w:r>
-              <w:t>PyPDF2 (PDF), python-docx (Word)</w:t>
-            </w:r>
-          </w:p>
-        </w:tc>
-      </w:tr>
-      <w:tr>
-        <w:tc>
-          <w:tcPr>
-            <w:tcW w:type="dxa" w:w="4320"/>
-          </w:tcPr>
-          <w:p>
-            <w:r>
-              <w:t>テキスト分割</w:t>
-            </w:r>
-          </w:p>
-        </w:tc>
-        <w:tc>
-          <w:tcPr>
-            <w:tcW w:type="dxa" w:w="4320"/>
-          </w:tcPr>
-          <w:p>
-            <w:r>
-              <w:t>langchain-text-splitters</w:t>
+              <w:t>PyPDF2, python-docx, openpyxl, python-pptx</w:t>
             </w:r>
           </w:p>
         </w:tc>
@@ -234,7 +284,7 @@
           </w:tcPr>
           <w:p>
             <w:r>
-              <w:t>GitHub Actions</w:t>
+              <w:t>GitHub Actions (OIDC認証)</w:t>
             </w:r>
           </w:p>
         </w:tc>
@@ -267,17 +317,41 @@
         <w:pStyle w:val="Heading1"/>
       </w:pPr>
       <w:r>
-        <w:t>アーキテクチャ</w:t>
+        <w:t>3. アーキテクチャ</w:t>
       </w:r>
     </w:p>
     <w:p>
       <w:r>
-        <w:t>[ユーザー] → [ALB] → [ECS Fargate コンテナ] → [FastAPI + TF-IDF検索 + Anthropic API (Claude Sonnet)]</w:t>
+        <w:t>ユーザー → ALB (HTTPS/SSL自動) → ECS Fargate コンテナ → FastAPI アプリケーション</w:t>
       </w:r>
     </w:p>
     <w:p>
       <w:r>
-        <w:t>ユーザーがアップロードしたPDF/Wordファイルからテキストを抽出し、チャンクに分割。質問時にTF-IDFで関連チャンクを検索し、Claude Sonnetに渡して回答を生成します。</w:t>
+        <w:t>アプリケーション内部の処理フロー:</w:t>
+      </w:r>
+    </w:p>
+    <w:p>
+      <w:pPr>
+        <w:pStyle w:val="ListBullet"/>
+      </w:pPr>
+      <w:r>
+        <w:t>ファイルアップロード → テキスト抽出 → 文単位チャンク分割 → Bedrock Titan Embeddings でベクトル化 → メモリ保持</w:t>
+      </w:r>
+    </w:p>
+    <w:p>
+      <w:pPr>
+        <w:pStyle w:val="ListBullet"/>
+      </w:pPr>
+      <w:r>
+        <w:t>ナレッジベース保存 → チャンク + メタデータ + 埋め込みベクトルをJSON化 → S3に保存</w:t>
+      </w:r>
+    </w:p>
+    <w:p>
+      <w:pPr>
+        <w:pStyle w:val="ListBullet"/>
+      </w:pPr>
+      <w:r>
+        <w:t>質問応答 → クエリ拡張 → 複数クエリで検索 → リランキング → 周辺コンテキスト結合 → Claude Sonnet で回答生成</w:t>
       </w:r>
     </w:p>
     <w:p>
@@ -285,7 +359,15 @@
         <w:pStyle w:val="Heading1"/>
       </w:pPr>
       <w:r>
-        <w:t>プロジェクト構成</w:t>
+        <w:t>4. 機能一覧</w:t>
+      </w:r>
+    </w:p>
+    <w:p>
+      <w:pPr>
+        <w:pStyle w:val="Heading2"/>
+      </w:pPr>
+      <w:r>
+        <w:t>4.1 認証</w:t>
       </w:r>
     </w:p>
     <w:p>
@@ -293,7 +375,7 @@
         <w:pStyle w:val="ListBullet"/>
       </w:pPr>
       <w:r>
-        <w:t>.github/workflows/deploy.yml  - CI/CD パイプライン</w:t>
+        <w:t>Cognito User Pool によるメール + パスワード認証</w:t>
       </w:r>
     </w:p>
     <w:p>
@@ -301,7 +383,7 @@
         <w:pStyle w:val="ListBullet"/>
       </w:pPr>
       <w:r>
-        <w:t>app/__init__.py</w:t>
+        <w:t>新規登録 → メール確認コード → ログイン</w:t>
       </w:r>
     </w:p>
     <w:p>
@@ -309,7 +391,7 @@
         <w:pStyle w:val="ListBullet"/>
       </w:pPr>
       <w:r>
-        <w:t>app/main.py                   - FastAPI アプリケーション</w:t>
+        <w:t>ログアウト機能</w:t>
       </w:r>
     </w:p>
     <w:p>
@@ -317,7 +399,15 @@
         <w:pStyle w:val="ListBullet"/>
       </w:pPr>
       <w:r>
-        <w:t>app/document_processor.py     - ドキュメント処理（PDF/Word）</w:t>
+        <w:t>未認証アクセスはログイン画面にリダイレクト</w:t>
+      </w:r>
+    </w:p>
+    <w:p>
+      <w:pPr>
+        <w:pStyle w:val="Heading2"/>
+      </w:pPr>
+      <w:r>
+        <w:t>4.2 ドキュメント管理</w:t>
       </w:r>
     </w:p>
     <w:p>
@@ -325,7 +415,7 @@
         <w:pStyle w:val="ListBullet"/>
       </w:pPr>
       <w:r>
-        <w:t>app/vector_store.py           - TF-IDF ベース検索エンジン</w:t>
+        <w:t>対応形式: PDF / Word (.docx) / Excel (.xlsx) / PowerPoint (.pptx) / CSV / テキスト (.txt, .md)</w:t>
       </w:r>
     </w:p>
     <w:p>
@@ -333,7 +423,7 @@
         <w:pStyle w:val="ListBullet"/>
       </w:pPr>
       <w:r>
-        <w:t>app/rag_engine.py             - RAG エンジン（Claude Sonnet連携）</w:t>
+        <w:t>複数ファイル同時アップロード（ファイル選択・ドラッグ&amp;ドロップ）</w:t>
       </w:r>
     </w:p>
     <w:p>
@@ -341,7 +431,7 @@
         <w:pStyle w:val="ListBullet"/>
       </w:pPr>
       <w:r>
-        <w:t>static/index.html             - チャットUI</w:t>
+        <w:t>大容量ファイルのバックグラウンド処理（進捗表示付き）</w:t>
       </w:r>
     </w:p>
     <w:p>
@@ -349,7 +439,7 @@
         <w:pStyle w:val="ListBullet"/>
       </w:pPr>
       <w:r>
-        <w:t>Dockerfile                    - コンテナイメージ定義</w:t>
+        <w:t>ファイル単位での削除</w:t>
       </w:r>
     </w:p>
     <w:p>
@@ -357,7 +447,15 @@
         <w:pStyle w:val="ListBullet"/>
       </w:pPr>
       <w:r>
-        <w:t>requirements.txt              - Python依存パッケージ</w:t>
+        <w:t>Bedrock スロットリング対策（指数バックオフ + 並列数制限）</w:t>
+      </w:r>
+    </w:p>
+    <w:p>
+      <w:pPr>
+        <w:pStyle w:val="Heading2"/>
+      </w:pPr>
+      <w:r>
+        <w:t>4.3 ナレッジベース管理</w:t>
       </w:r>
     </w:p>
     <w:p>
@@ -365,7 +463,167 @@
         <w:pStyle w:val="ListBullet"/>
       </w:pPr>
       <w:r>
-        <w:t>README.md                     - プロジェクト説明</w:t>
+        <w:t>名前を付けて保存（S3に永続化）</w:t>
+      </w:r>
+    </w:p>
+    <w:p>
+      <w:pPr>
+        <w:pStyle w:val="ListBullet"/>
+      </w:pPr>
+      <w:r>
+        <w:t>保存済みナレッジベースの一覧表示・読み込み</w:t>
+      </w:r>
+    </w:p>
+    <w:p>
+      <w:pPr>
+        <w:pStyle w:val="ListBullet"/>
+      </w:pPr>
+      <w:r>
+        <w:t>ナレッジベースへのファイル追加</w:t>
+      </w:r>
+    </w:p>
+    <w:p>
+      <w:pPr>
+        <w:pStyle w:val="ListBullet"/>
+      </w:pPr>
+      <w:r>
+        <w:t>上書き保存（ファイル追加/削除後にアクティブ化）</w:t>
+      </w:r>
+    </w:p>
+    <w:p>
+      <w:pPr>
+        <w:pStyle w:val="ListBullet"/>
+      </w:pPr>
+      <w:r>
+        <w:t>ナレッジベースの削除</w:t>
+      </w:r>
+    </w:p>
+    <w:p>
+      <w:pPr>
+        <w:pStyle w:val="ListBullet"/>
+      </w:pPr>
+      <w:r>
+        <w:t>埋め込みベクトルごと保存するため、読み込み時に再計算不要</w:t>
+      </w:r>
+    </w:p>
+    <w:p>
+      <w:pPr>
+        <w:pStyle w:val="Heading2"/>
+      </w:pPr>
+      <w:r>
+        <w:t>4.4 チャット (RAG)</w:t>
+      </w:r>
+    </w:p>
+    <w:p>
+      <w:pPr>
+        <w:pStyle w:val="ListBullet"/>
+      </w:pPr>
+      <w:r>
+        <w:t>会話履歴の保持（直近10往復）</w:t>
+      </w:r>
+    </w:p>
+    <w:p>
+      <w:pPr>
+        <w:pStyle w:val="ListBullet"/>
+      </w:pPr>
+      <w:r>
+        <w:t>クエリ拡張: 質問の意図を分析し、複数の検索クエリを自動生成</w:t>
+      </w:r>
+    </w:p>
+    <w:p>
+      <w:pPr>
+        <w:pStyle w:val="ListBullet"/>
+      </w:pPr>
+      <w:r>
+        <w:t>リランキング: Claude が検索結果の関連度を再評価</w:t>
+      </w:r>
+    </w:p>
+    <w:p>
+      <w:pPr>
+        <w:pStyle w:val="ListBullet"/>
+      </w:pPr>
+      <w:r>
+        <w:t>周辺コンテキスト: ヒットチャンクの前後も結合して情報量を確保</w:t>
+      </w:r>
+    </w:p>
+    <w:p>
+      <w:pPr>
+        <w:pStyle w:val="ListBullet"/>
+      </w:pPr>
+      <w:r>
+        <w:t>確信度表示（検索スコアに基づく）</w:t>
+      </w:r>
+    </w:p>
+    <w:p>
+      <w:pPr>
+        <w:pStyle w:val="ListBullet"/>
+      </w:pPr>
+      <w:r>
+        <w:t>出典表示（ファイル名 + PDFページ番号）</w:t>
+      </w:r>
+    </w:p>
+    <w:p>
+      <w:pPr>
+        <w:pStyle w:val="ListBullet"/>
+      </w:pPr>
+      <w:r>
+        <w:t>フィードバックボタン（👍 役立った / 👎 不十分）</w:t>
+      </w:r>
+    </w:p>
+    <w:p>
+      <w:pPr>
+        <w:pStyle w:val="ListBullet"/>
+      </w:pPr>
+      <w:r>
+        <w:t>チャット履歴のWord (.docx) エクスポート</w:t>
+      </w:r>
+    </w:p>
+    <w:p>
+      <w:pPr>
+        <w:pStyle w:val="ListBullet"/>
+      </w:pPr>
+      <w:r>
+        <w:t>検索結果の多様性確保（1ファイルあたり最大3チャンク）</w:t>
+      </w:r>
+    </w:p>
+    <w:p>
+      <w:pPr>
+        <w:pStyle w:val="Heading2"/>
+      </w:pPr>
+      <w:r>
+        <w:t>4.5 UI/UX</w:t>
+      </w:r>
+    </w:p>
+    <w:p>
+      <w:pPr>
+        <w:pStyle w:val="ListBullet"/>
+      </w:pPr>
+      <w:r>
+        <w:t>ライトモード / ダークモード切替（ブラウザに設定保存）</w:t>
+      </w:r>
+    </w:p>
+    <w:p>
+      <w:pPr>
+        <w:pStyle w:val="ListBullet"/>
+      </w:pPr>
+      <w:r>
+        <w:t>スマートフォン対応（レスポンシブデザイン）</w:t>
+      </w:r>
+    </w:p>
+    <w:p>
+      <w:pPr>
+        <w:pStyle w:val="ListBullet"/>
+      </w:pPr>
+      <w:r>
+        <w:t>ヘッダーにLLMモデル名・ログインユーザー表示</w:t>
+      </w:r>
+    </w:p>
+    <w:p>
+      <w:pPr>
+        <w:pStyle w:val="ListBullet"/>
+      </w:pPr>
+      <w:r>
+        <w:t>ナレッジベース選択をトップに配置</w:t>
       </w:r>
     </w:p>
     <w:p>
@@ -373,7 +631,56 @@
         <w:pStyle w:val="Heading1"/>
       </w:pPr>
       <w:r>
-        <w:t>機能一覧</w:t>
+        <w:t>5. RAG処理フロー（質問応答）</w:t>
+      </w:r>
+    </w:p>
+    <w:p>
+      <w:r>
+        <w:t>1つの質問に対して以下の処理が実行される:</w:t>
+      </w:r>
+    </w:p>
+    <w:p>
+      <w:r>
+        <w:t>1. クエリ拡張: Claude が質問の意図を分析し、3つの追加検索クエリを生成</w:t>
+      </w:r>
+    </w:p>
+    <w:p>
+      <w:r>
+        <w:t>2. ベクトル検索: 元の質問 + 3つの拡張クエリで候補チャンクを収集（重複排除）</w:t>
+      </w:r>
+    </w:p>
+    <w:p>
+      <w:r>
+        <w:t>3. リランキング: Claude が候補チャンク（最大15件）の関連度を1〜5で評価</w:t>
+      </w:r>
+    </w:p>
+    <w:p>
+      <w:r>
+        <w:t>4. フィルタリング: 関連度3以上のチャンクのみ残す（上位6件）</w:t>
+      </w:r>
+    </w:p>
+    <w:p>
+      <w:r>
+        <w:t>5. 周辺コンテキスト: ヒットチャンクの前後チャンクを結合</w:t>
+      </w:r>
+    </w:p>
+    <w:p>
+      <w:r>
+        <w:t>6. 回答生成: 構造化プロンプト（結論→根拠→補足）で Claude が回答</w:t>
+      </w:r>
+    </w:p>
+    <w:p/>
+    <w:p>
+      <w:r>
+        <w:t>Claude API 呼び出し回数: 1質問あたり3回（拡張 + リランキング + 回答）</w:t>
+      </w:r>
+    </w:p>
+    <w:p>
+      <w:pPr>
+        <w:pStyle w:val="Heading1"/>
+      </w:pPr>
+      <w:r>
+        <w:t>6. デプロイ構成</w:t>
       </w:r>
     </w:p>
     <w:p>
@@ -381,47 +688,32 @@
         <w:pStyle w:val="Heading2"/>
       </w:pPr>
       <w:r>
-        <w:t>ドキュメント管理</w:t>
+        <w:t>6.1 CI/CD パイプライン</w:t>
       </w:r>
     </w:p>
     <w:p>
-      <w:pPr>
-        <w:pStyle w:val="ListBullet"/>
-      </w:pPr>
       <w:r>
-        <w:t>PDF ファイルのアップロード・テキスト抽出</w:t>
+        <w:t>1. main ブランチへの git push をトリガー</w:t>
       </w:r>
     </w:p>
     <w:p>
-      <w:pPr>
-        <w:pStyle w:val="ListBullet"/>
-      </w:pPr>
       <w:r>
-        <w:t>Word (.docx) ファイルのアップロード・テキスト抽出</w:t>
+        <w:t>2. GitHub OIDC で AWS 認証（シークレットキー不要）</w:t>
       </w:r>
     </w:p>
     <w:p>
-      <w:pPr>
-        <w:pStyle w:val="ListBullet"/>
-      </w:pPr>
       <w:r>
-        <w:t>複数ファイルの同時管理</w:t>
+        <w:t>3. Docker イメージのビルド（GitHub Actions ランナー上）</w:t>
       </w:r>
     </w:p>
     <w:p>
-      <w:pPr>
-        <w:pStyle w:val="ListBullet"/>
-      </w:pPr>
       <w:r>
-        <w:t>アップロード済みドキュメントの一覧表示</w:t>
+        <w:t>4. Amazon ECR へプッシュ</w:t>
       </w:r>
     </w:p>
     <w:p>
-      <w:pPr>
-        <w:pStyle w:val="ListBullet"/>
-      </w:pPr>
       <w:r>
-        <w:t>全データの一括削除</w:t>
+        <w:t>5. ECS Express Mode でデプロイ（ローリングアップデート）</w:t>
       </w:r>
     </w:p>
     <w:p>
@@ -429,39 +721,273 @@
         <w:pStyle w:val="Heading2"/>
       </w:pPr>
       <w:r>
-        <w:t>チャット機能</w:t>
+        <w:t>6.2 AWS リソース</w:t>
+      </w:r>
+    </w:p>
+    <w:tbl>
+      <w:tblPr>
+        <w:tblStyle w:val="LightGrid-Accent1"/>
+        <w:tblW w:type="auto" w:w="0"/>
+        <w:tblLook w:firstColumn="1" w:firstRow="1" w:lastColumn="0" w:lastRow="0" w:noHBand="0" w:noVBand="1" w:val="04A0"/>
+      </w:tblPr>
+      <w:tblGrid>
+        <w:gridCol w:w="4320"/>
+        <w:gridCol w:w="4320"/>
+      </w:tblGrid>
+      <w:tr>
+        <w:tc>
+          <w:tcPr>
+            <w:tcW w:type="dxa" w:w="4320"/>
+          </w:tcPr>
+          <w:p>
+            <w:r>
+              <w:t>リソース</w:t>
+            </w:r>
+          </w:p>
+        </w:tc>
+        <w:tc>
+          <w:tcPr>
+            <w:tcW w:type="dxa" w:w="4320"/>
+          </w:tcPr>
+          <w:p>
+            <w:r>
+              <w:t>設定</w:t>
+            </w:r>
+          </w:p>
+        </w:tc>
+      </w:tr>
+      <w:tr>
+        <w:tc>
+          <w:tcPr>
+            <w:tcW w:type="dxa" w:w="4320"/>
+          </w:tcPr>
+          <w:p>
+            <w:r>
+              <w:t>ECS サービス</w:t>
+            </w:r>
+          </w:p>
+        </w:tc>
+        <w:tc>
+          <w:tcPr>
+            <w:tcW w:type="dxa" w:w="4320"/>
+          </w:tcPr>
+          <w:p>
+            <w:r>
+              <w:t>simple-rag (Express Mode, Fargate)</w:t>
+            </w:r>
+          </w:p>
+        </w:tc>
+      </w:tr>
+      <w:tr>
+        <w:tc>
+          <w:tcPr>
+            <w:tcW w:type="dxa" w:w="4320"/>
+          </w:tcPr>
+          <w:p>
+            <w:r>
+              <w:t>CPU / メモリ</w:t>
+            </w:r>
+          </w:p>
+        </w:tc>
+        <w:tc>
+          <w:tcPr>
+            <w:tcW w:type="dxa" w:w="4320"/>
+          </w:tcPr>
+          <w:p>
+            <w:r>
+              <w:t>1 vCPU / 2 GB</w:t>
+            </w:r>
+          </w:p>
+        </w:tc>
+      </w:tr>
+      <w:tr>
+        <w:tc>
+          <w:tcPr>
+            <w:tcW w:type="dxa" w:w="4320"/>
+          </w:tcPr>
+          <w:p>
+            <w:r>
+              <w:t>オートスケーリング</w:t>
+            </w:r>
+          </w:p>
+        </w:tc>
+        <w:tc>
+          <w:tcPr>
+            <w:tcW w:type="dxa" w:w="4320"/>
+          </w:tcPr>
+          <w:p>
+            <w:r>
+              <w:t>0〜20タスク (CPU 60%ターゲット)</w:t>
+            </w:r>
+          </w:p>
+        </w:tc>
+      </w:tr>
+      <w:tr>
+        <w:tc>
+          <w:tcPr>
+            <w:tcW w:type="dxa" w:w="4320"/>
+          </w:tcPr>
+          <w:p>
+            <w:r>
+              <w:t>ECR リポジトリ</w:t>
+            </w:r>
+          </w:p>
+        </w:tc>
+        <w:tc>
+          <w:tcPr>
+            <w:tcW w:type="dxa" w:w="4320"/>
+          </w:tcPr>
+          <w:p>
+            <w:r>
+              <w:t>simple-rag</w:t>
+            </w:r>
+          </w:p>
+        </w:tc>
+      </w:tr>
+      <w:tr>
+        <w:tc>
+          <w:tcPr>
+            <w:tcW w:type="dxa" w:w="4320"/>
+          </w:tcPr>
+          <w:p>
+            <w:r>
+              <w:t>S3 バケット</w:t>
+            </w:r>
+          </w:p>
+        </w:tc>
+        <w:tc>
+          <w:tcPr>
+            <w:tcW w:type="dxa" w:w="4320"/>
+          </w:tcPr>
+          <w:p>
+            <w:r>
+              <w:t>simple-rag-knowledge-032401368831</w:t>
+            </w:r>
+          </w:p>
+        </w:tc>
+      </w:tr>
+      <w:tr>
+        <w:tc>
+          <w:tcPr>
+            <w:tcW w:type="dxa" w:w="4320"/>
+          </w:tcPr>
+          <w:p>
+            <w:r>
+              <w:t>Cognito User Pool</w:t>
+            </w:r>
+          </w:p>
+        </w:tc>
+        <w:tc>
+          <w:tcPr>
+            <w:tcW w:type="dxa" w:w="4320"/>
+          </w:tcPr>
+          <w:p>
+            <w:r>
+              <w:t>simple-rag-users</w:t>
+            </w:r>
+          </w:p>
+        </w:tc>
+      </w:tr>
+      <w:tr>
+        <w:tc>
+          <w:tcPr>
+            <w:tcW w:type="dxa" w:w="4320"/>
+          </w:tcPr>
+          <w:p>
+            <w:r>
+              <w:t>IAM ロール (Task)</w:t>
+            </w:r>
+          </w:p>
+        </w:tc>
+        <w:tc>
+          <w:tcPr>
+            <w:tcW w:type="dxa" w:w="4320"/>
+          </w:tcPr>
+          <w:p>
+            <w:r>
+              <w:t>ecsTaskRole-SimpleRAG</w:t>
+            </w:r>
+          </w:p>
+        </w:tc>
+      </w:tr>
+      <w:tr>
+        <w:tc>
+          <w:tcPr>
+            <w:tcW w:type="dxa" w:w="4320"/>
+          </w:tcPr>
+          <w:p>
+            <w:r>
+              <w:t>IAM ロール (Execution)</w:t>
+            </w:r>
+          </w:p>
+        </w:tc>
+        <w:tc>
+          <w:tcPr>
+            <w:tcW w:type="dxa" w:w="4320"/>
+          </w:tcPr>
+          <w:p>
+            <w:r>
+              <w:t>ecsTaskExecutionRole</w:t>
+            </w:r>
+          </w:p>
+        </w:tc>
+      </w:tr>
+      <w:tr>
+        <w:tc>
+          <w:tcPr>
+            <w:tcW w:type="dxa" w:w="4320"/>
+          </w:tcPr>
+          <w:p>
+            <w:r>
+              <w:t>IAM ロール (Infrastructure)</w:t>
+            </w:r>
+          </w:p>
+        </w:tc>
+        <w:tc>
+          <w:tcPr>
+            <w:tcW w:type="dxa" w:w="4320"/>
+          </w:tcPr>
+          <w:p>
+            <w:r>
+              <w:t>ecsInfrastructureRoleForExpressServices</w:t>
+            </w:r>
+          </w:p>
+        </w:tc>
+      </w:tr>
+      <w:tr>
+        <w:tc>
+          <w:tcPr>
+            <w:tcW w:type="dxa" w:w="4320"/>
+          </w:tcPr>
+          <w:p>
+            <w:r>
+              <w:t>IAM ロール (GitHub Actions)</w:t>
+            </w:r>
+          </w:p>
+        </w:tc>
+        <w:tc>
+          <w:tcPr>
+            <w:tcW w:type="dxa" w:w="4320"/>
+          </w:tcPr>
+          <w:p>
+            <w:r>
+              <w:t>GitHubActionsRole-SimpleRAG</w:t>
+            </w:r>
+          </w:p>
+        </w:tc>
+      </w:tr>
+    </w:tbl>
+    <w:p>
+      <w:pPr>
+        <w:pStyle w:val="Heading2"/>
+      </w:pPr>
+      <w:r>
+        <w:t>6.3 コスト最適化</w:t>
       </w:r>
     </w:p>
     <w:p>
-      <w:pPr>
-        <w:pStyle w:val="ListBullet"/>
-      </w:pPr>
       <w:r>
-        <w:t>自然言語による質問入力</w:t>
-      </w:r>
-    </w:p>
-    <w:p>
-      <w:pPr>
-        <w:pStyle w:val="ListBullet"/>
-      </w:pPr>
-      <w:r>
-        <w:t>アップロード済みドキュメントに基づく回答生成</w:t>
-      </w:r>
-    </w:p>
-    <w:p>
-      <w:pPr>
-        <w:pStyle w:val="ListBullet"/>
-      </w:pPr>
-      <w:r>
-        <w:t>回答の出典（ファイル名）表示</w:t>
-      </w:r>
-    </w:p>
-    <w:p>
-      <w:pPr>
-        <w:pStyle w:val="ListBullet"/>
-      </w:pPr>
-      <w:r>
-        <w:t>リアルタイムのタイピングインジケーター</w:t>
+        <w:t>ECS の最小タスク数を 0 に設定。アクセスがない時間帯はタスクが自動停止し、Fargate の課金がゼロになる。次のアクセス時に自動起動（コールドスタート: 30〜60秒）。</w:t>
       </w:r>
     </w:p>
     <w:p>
@@ -469,7 +995,158 @@
         <w:pStyle w:val="Heading1"/>
       </w:pPr>
       <w:r>
-        <w:t>API エンドポイント</w:t>
+        <w:t>7. チャンク分割戦略</w:t>
+      </w:r>
+    </w:p>
+    <w:tbl>
+      <w:tblPr>
+        <w:tblStyle w:val="LightGrid-Accent1"/>
+        <w:tblW w:type="auto" w:w="0"/>
+        <w:tblLook w:firstColumn="1" w:firstRow="1" w:lastColumn="0" w:lastRow="0" w:noHBand="0" w:noVBand="1" w:val="04A0"/>
+      </w:tblPr>
+      <w:tblGrid>
+        <w:gridCol w:w="4320"/>
+        <w:gridCol w:w="4320"/>
+      </w:tblGrid>
+      <w:tr>
+        <w:tc>
+          <w:tcPr>
+            <w:tcW w:type="dxa" w:w="4320"/>
+          </w:tcPr>
+          <w:p>
+            <w:r>
+              <w:t>パラメータ</w:t>
+            </w:r>
+          </w:p>
+        </w:tc>
+        <w:tc>
+          <w:tcPr>
+            <w:tcW w:type="dxa" w:w="4320"/>
+          </w:tcPr>
+          <w:p>
+            <w:r>
+              <w:t>値</w:t>
+            </w:r>
+          </w:p>
+        </w:tc>
+      </w:tr>
+      <w:tr>
+        <w:tc>
+          <w:tcPr>
+            <w:tcW w:type="dxa" w:w="4320"/>
+          </w:tcPr>
+          <w:p>
+            <w:r>
+              <w:t>チャンクサイズ</w:t>
+            </w:r>
+          </w:p>
+        </w:tc>
+        <w:tc>
+          <w:tcPr>
+            <w:tcW w:type="dxa" w:w="4320"/>
+          </w:tcPr>
+          <w:p>
+            <w:r>
+              <w:t>700文字</w:t>
+            </w:r>
+          </w:p>
+        </w:tc>
+      </w:tr>
+      <w:tr>
+        <w:tc>
+          <w:tcPr>
+            <w:tcW w:type="dxa" w:w="4320"/>
+          </w:tcPr>
+          <w:p>
+            <w:r>
+              <w:t>オーバーラップ</w:t>
+            </w:r>
+          </w:p>
+        </w:tc>
+        <w:tc>
+          <w:tcPr>
+            <w:tcW w:type="dxa" w:w="4320"/>
+          </w:tcPr>
+          <w:p>
+            <w:r>
+              <w:t>150文字</w:t>
+            </w:r>
+          </w:p>
+        </w:tc>
+      </w:tr>
+      <w:tr>
+        <w:tc>
+          <w:tcPr>
+            <w:tcW w:type="dxa" w:w="4320"/>
+          </w:tcPr>
+          <w:p>
+            <w:r>
+              <w:t>分割単位</w:t>
+            </w:r>
+          </w:p>
+        </w:tc>
+        <w:tc>
+          <w:tcPr>
+            <w:tcW w:type="dxa" w:w="4320"/>
+          </w:tcPr>
+          <w:p>
+            <w:r>
+              <w:t>文単位（日本語句点・英語ピリオドで分割）</w:t>
+            </w:r>
+          </w:p>
+        </w:tc>
+      </w:tr>
+      <w:tr>
+        <w:tc>
+          <w:tcPr>
+            <w:tcW w:type="dxa" w:w="4320"/>
+          </w:tcPr>
+          <w:p>
+            <w:r>
+              <w:t>段落境界</w:t>
+            </w:r>
+          </w:p>
+        </w:tc>
+        <w:tc>
+          <w:tcPr>
+            <w:tcW w:type="dxa" w:w="4320"/>
+          </w:tcPr>
+          <w:p>
+            <w:r>
+              <w:t>チャンクサイズの60%以上で段落境界を優先的に分割点にする</w:t>
+            </w:r>
+          </w:p>
+        </w:tc>
+      </w:tr>
+      <w:tr>
+        <w:tc>
+          <w:tcPr>
+            <w:tcW w:type="dxa" w:w="4320"/>
+          </w:tcPr>
+          <w:p>
+            <w:r>
+              <w:t>日本語対応</w:t>
+            </w:r>
+          </w:p>
+        </w:tc>
+        <w:tc>
+          <w:tcPr>
+            <w:tcW w:type="dxa" w:w="4320"/>
+          </w:tcPr>
+          <w:p>
+            <w:r>
+              <w:t>「。」「！」「？」を文末として認識</w:t>
+            </w:r>
+          </w:p>
+        </w:tc>
+      </w:tr>
+    </w:tbl>
+    <w:p>
+      <w:pPr>
+        <w:pStyle w:val="Heading1"/>
+      </w:pPr>
+      <w:r>
+        <w:t>8. API エンドポイント</w:t>
       </w:r>
     </w:p>
     <w:tbl>
@@ -542,7 +1219,167 @@
           </w:tcPr>
           <w:p>
             <w:r>
-              <w:t>チャットUI</w:t>
+              <w:t>メインUI</w:t>
+            </w:r>
+          </w:p>
+        </w:tc>
+      </w:tr>
+      <w:tr>
+        <w:tc>
+          <w:tcPr>
+            <w:tcW w:type="dxa" w:w="2880"/>
+          </w:tcPr>
+          <w:p>
+            <w:r>
+              <w:t>GET</w:t>
+            </w:r>
+          </w:p>
+        </w:tc>
+        <w:tc>
+          <w:tcPr>
+            <w:tcW w:type="dxa" w:w="2880"/>
+          </w:tcPr>
+          <w:p>
+            <w:r>
+              <w:t>/login</w:t>
+            </w:r>
+          </w:p>
+        </w:tc>
+        <w:tc>
+          <w:tcPr>
+            <w:tcW w:type="dxa" w:w="2880"/>
+          </w:tcPr>
+          <w:p>
+            <w:r>
+              <w:t>ログイン画面</w:t>
+            </w:r>
+          </w:p>
+        </w:tc>
+      </w:tr>
+      <w:tr>
+        <w:tc>
+          <w:tcPr>
+            <w:tcW w:type="dxa" w:w="2880"/>
+          </w:tcPr>
+          <w:p>
+            <w:r>
+              <w:t>POST</w:t>
+            </w:r>
+          </w:p>
+        </w:tc>
+        <w:tc>
+          <w:tcPr>
+            <w:tcW w:type="dxa" w:w="2880"/>
+          </w:tcPr>
+          <w:p>
+            <w:r>
+              <w:t>/api/auth/signup</w:t>
+            </w:r>
+          </w:p>
+        </w:tc>
+        <w:tc>
+          <w:tcPr>
+            <w:tcW w:type="dxa" w:w="2880"/>
+          </w:tcPr>
+          <w:p>
+            <w:r>
+              <w:t>新規登録</w:t>
+            </w:r>
+          </w:p>
+        </w:tc>
+      </w:tr>
+      <w:tr>
+        <w:tc>
+          <w:tcPr>
+            <w:tcW w:type="dxa" w:w="2880"/>
+          </w:tcPr>
+          <w:p>
+            <w:r>
+              <w:t>POST</w:t>
+            </w:r>
+          </w:p>
+        </w:tc>
+        <w:tc>
+          <w:tcPr>
+            <w:tcW w:type="dxa" w:w="2880"/>
+          </w:tcPr>
+          <w:p>
+            <w:r>
+              <w:t>/api/auth/confirm</w:t>
+            </w:r>
+          </w:p>
+        </w:tc>
+        <w:tc>
+          <w:tcPr>
+            <w:tcW w:type="dxa" w:w="2880"/>
+          </w:tcPr>
+          <w:p>
+            <w:r>
+              <w:t>メール確認</w:t>
+            </w:r>
+          </w:p>
+        </w:tc>
+      </w:tr>
+      <w:tr>
+        <w:tc>
+          <w:tcPr>
+            <w:tcW w:type="dxa" w:w="2880"/>
+          </w:tcPr>
+          <w:p>
+            <w:r>
+              <w:t>POST</w:t>
+            </w:r>
+          </w:p>
+        </w:tc>
+        <w:tc>
+          <w:tcPr>
+            <w:tcW w:type="dxa" w:w="2880"/>
+          </w:tcPr>
+          <w:p>
+            <w:r>
+              <w:t>/api/auth/signin</w:t>
+            </w:r>
+          </w:p>
+        </w:tc>
+        <w:tc>
+          <w:tcPr>
+            <w:tcW w:type="dxa" w:w="2880"/>
+          </w:tcPr>
+          <w:p>
+            <w:r>
+              <w:t>ログイン</w:t>
+            </w:r>
+          </w:p>
+        </w:tc>
+      </w:tr>
+      <w:tr>
+        <w:tc>
+          <w:tcPr>
+            <w:tcW w:type="dxa" w:w="2880"/>
+          </w:tcPr>
+          <w:p>
+            <w:r>
+              <w:t>GET</w:t>
+            </w:r>
+          </w:p>
+        </w:tc>
+        <w:tc>
+          <w:tcPr>
+            <w:tcW w:type="dxa" w:w="2880"/>
+          </w:tcPr>
+          <w:p>
+            <w:r>
+              <w:t>/api/auth/me</w:t>
+            </w:r>
+          </w:p>
+        </w:tc>
+        <w:tc>
+          <w:tcPr>
+            <w:tcW w:type="dxa" w:w="2880"/>
+          </w:tcPr>
+          <w:p>
+            <w:r>
+              <w:t>ユーザー情報取得</w:t>
             </w:r>
           </w:p>
         </w:tc>
@@ -574,7 +1411,39 @@
           </w:tcPr>
           <w:p>
             <w:r>
-              <w:t>ドキュメントアップロード</w:t>
+              <w:t>ファイルアップロード</w:t>
+            </w:r>
+          </w:p>
+        </w:tc>
+      </w:tr>
+      <w:tr>
+        <w:tc>
+          <w:tcPr>
+            <w:tcW w:type="dxa" w:w="2880"/>
+          </w:tcPr>
+          <w:p>
+            <w:r>
+              <w:t>GET</w:t>
+            </w:r>
+          </w:p>
+        </w:tc>
+        <w:tc>
+          <w:tcPr>
+            <w:tcW w:type="dxa" w:w="2880"/>
+          </w:tcPr>
+          <w:p>
+            <w:r>
+              <w:t>/api/processing/{filename}</w:t>
+            </w:r>
+          </w:p>
+        </w:tc>
+        <w:tc>
+          <w:tcPr>
+            <w:tcW w:type="dxa" w:w="2880"/>
+          </w:tcPr>
+          <w:p>
+            <w:r>
+              <w:t>処理状況確認</w:t>
             </w:r>
           </w:p>
         </w:tc>
@@ -638,7 +1507,39 @@
           </w:tcPr>
           <w:p>
             <w:r>
-              <w:t>アップロード状況確認</w:t>
+              <w:t>統計情報</w:t>
+            </w:r>
+          </w:p>
+        </w:tc>
+      </w:tr>
+      <w:tr>
+        <w:tc>
+          <w:tcPr>
+            <w:tcW w:type="dxa" w:w="2880"/>
+          </w:tcPr>
+          <w:p>
+            <w:r>
+              <w:t>DELETE</w:t>
+            </w:r>
+          </w:p>
+        </w:tc>
+        <w:tc>
+          <w:tcPr>
+            <w:tcW w:type="dxa" w:w="2880"/>
+          </w:tcPr>
+          <w:p>
+            <w:r>
+              <w:t>/api/document/{filename}</w:t>
+            </w:r>
+          </w:p>
+        </w:tc>
+        <w:tc>
+          <w:tcPr>
+            <w:tcW w:type="dxa" w:w="2880"/>
+          </w:tcPr>
+          <w:p>
+            <w:r>
+              <w:t>ファイル削除</w:t>
             </w:r>
           </w:p>
         </w:tc>
@@ -670,352 +1571,7 @@
           </w:tcPr>
           <w:p>
             <w:r>
-              <w:t>全データ削除</w:t>
-            </w:r>
-          </w:p>
-        </w:tc>
-      </w:tr>
-    </w:tbl>
-    <w:p>
-      <w:pPr>
-        <w:pStyle w:val="Heading1"/>
-      </w:pPr>
-      <w:r>
-        <w:t>デプロイ構成</w:t>
-      </w:r>
-    </w:p>
-    <w:p>
-      <w:pPr>
-        <w:pStyle w:val="Heading2"/>
-      </w:pPr>
-      <w:r>
-        <w:t>CI/CD パイプライン (GitHub Actions)</w:t>
-      </w:r>
-    </w:p>
-    <w:p>
-      <w:r>
-        <w:t>1. main ブランチへのプッシュをトリガー</w:t>
-      </w:r>
-    </w:p>
-    <w:p>
-      <w:r>
-        <w:t>2. GitHub OIDC でAWS認証（シークレットキー不要）</w:t>
-      </w:r>
-    </w:p>
-    <w:p>
-      <w:r>
-        <w:t>3. Dockerイメージのビルド</w:t>
-      </w:r>
-    </w:p>
-    <w:p>
-      <w:r>
-        <w:t>4. Amazon ECR へプッシュ</w:t>
-      </w:r>
-    </w:p>
-    <w:p>
-      <w:r>
-        <w:t>5. ECS Express Mode でデプロイ</w:t>
-      </w:r>
-    </w:p>
-    <w:p>
-      <w:pPr>
-        <w:pStyle w:val="Heading2"/>
-      </w:pPr>
-      <w:r>
-        <w:t>AWS リソース</w:t>
-      </w:r>
-    </w:p>
-    <w:tbl>
-      <w:tblPr>
-        <w:tblStyle w:val="LightGrid-Accent1"/>
-        <w:tblW w:type="auto" w:w="0"/>
-        <w:tblLook w:firstColumn="1" w:firstRow="1" w:lastColumn="0" w:lastRow="0" w:noHBand="0" w:noVBand="1" w:val="04A0"/>
-      </w:tblPr>
-      <w:tblGrid>
-        <w:gridCol w:w="4320"/>
-        <w:gridCol w:w="4320"/>
-      </w:tblGrid>
-      <w:tr>
-        <w:tc>
-          <w:tcPr>
-            <w:tcW w:type="dxa" w:w="4320"/>
-          </w:tcPr>
-          <w:p>
-            <w:r>
-              <w:t>リソース</w:t>
-            </w:r>
-          </w:p>
-        </w:tc>
-        <w:tc>
-          <w:tcPr>
-            <w:tcW w:type="dxa" w:w="4320"/>
-          </w:tcPr>
-          <w:p>
-            <w:r>
-              <w:t>名前/設定</w:t>
-            </w:r>
-          </w:p>
-        </w:tc>
-      </w:tr>
-      <w:tr>
-        <w:tc>
-          <w:tcPr>
-            <w:tcW w:type="dxa" w:w="4320"/>
-          </w:tcPr>
-          <w:p>
-            <w:r>
-              <w:t>ECR リポジトリ</w:t>
-            </w:r>
-          </w:p>
-        </w:tc>
-        <w:tc>
-          <w:tcPr>
-            <w:tcW w:type="dxa" w:w="4320"/>
-          </w:tcPr>
-          <w:p>
-            <w:r>
-              <w:t>simple-rag</w:t>
-            </w:r>
-          </w:p>
-        </w:tc>
-      </w:tr>
-      <w:tr>
-        <w:tc>
-          <w:tcPr>
-            <w:tcW w:type="dxa" w:w="4320"/>
-          </w:tcPr>
-          <w:p>
-            <w:r>
-              <w:t>ECS クラスター</w:t>
-            </w:r>
-          </w:p>
-        </w:tc>
-        <w:tc>
-          <w:tcPr>
-            <w:tcW w:type="dxa" w:w="4320"/>
-          </w:tcPr>
-          <w:p>
-            <w:r>
-              <w:t>default</w:t>
-            </w:r>
-          </w:p>
-        </w:tc>
-      </w:tr>
-      <w:tr>
-        <w:tc>
-          <w:tcPr>
-            <w:tcW w:type="dxa" w:w="4320"/>
-          </w:tcPr>
-          <w:p>
-            <w:r>
-              <w:t>ECS サービス</w:t>
-            </w:r>
-          </w:p>
-        </w:tc>
-        <w:tc>
-          <w:tcPr>
-            <w:tcW w:type="dxa" w:w="4320"/>
-          </w:tcPr>
-          <w:p>
-            <w:r>
-              <w:t>simple-rag (Express Mode)</w:t>
-            </w:r>
-          </w:p>
-        </w:tc>
-      </w:tr>
-      <w:tr>
-        <w:tc>
-          <w:tcPr>
-            <w:tcW w:type="dxa" w:w="4320"/>
-          </w:tcPr>
-          <w:p>
-            <w:r>
-              <w:t>CPU / メモリ</w:t>
-            </w:r>
-          </w:p>
-        </w:tc>
-        <w:tc>
-          <w:tcPr>
-            <w:tcW w:type="dxa" w:w="4320"/>
-          </w:tcPr>
-          <w:p>
-            <w:r>
-              <w:t>1 vCPU / 2 GB</w:t>
-            </w:r>
-          </w:p>
-        </w:tc>
-      </w:tr>
-      <w:tr>
-        <w:tc>
-          <w:tcPr>
-            <w:tcW w:type="dxa" w:w="4320"/>
-          </w:tcPr>
-          <w:p>
-            <w:r>
-              <w:t>オートスケーリング</w:t>
-            </w:r>
-          </w:p>
-        </w:tc>
-        <w:tc>
-          <w:tcPr>
-            <w:tcW w:type="dxa" w:w="4320"/>
-          </w:tcPr>
-          <w:p>
-            <w:r>
-              <w:t>1〜20タスク (CPU 60%ターゲット)</w:t>
-            </w:r>
-          </w:p>
-        </w:tc>
-      </w:tr>
-      <w:tr>
-        <w:tc>
-          <w:tcPr>
-            <w:tcW w:type="dxa" w:w="4320"/>
-          </w:tcPr>
-          <w:p>
-            <w:r>
-              <w:t>IAM ロール (Task Execution)</w:t>
-            </w:r>
-          </w:p>
-        </w:tc>
-        <w:tc>
-          <w:tcPr>
-            <w:tcW w:type="dxa" w:w="4320"/>
-          </w:tcPr>
-          <w:p>
-            <w:r>
-              <w:t>ecsTaskExecutionRole</w:t>
-            </w:r>
-          </w:p>
-        </w:tc>
-      </w:tr>
-      <w:tr>
-        <w:tc>
-          <w:tcPr>
-            <w:tcW w:type="dxa" w:w="4320"/>
-          </w:tcPr>
-          <w:p>
-            <w:r>
-              <w:t>IAM ロール (Infrastructure)</w:t>
-            </w:r>
-          </w:p>
-        </w:tc>
-        <w:tc>
-          <w:tcPr>
-            <w:tcW w:type="dxa" w:w="4320"/>
-          </w:tcPr>
-          <w:p>
-            <w:r>
-              <w:t>ecsInfrastructureRoleForExpressServices</w:t>
-            </w:r>
-          </w:p>
-        </w:tc>
-      </w:tr>
-      <w:tr>
-        <w:tc>
-          <w:tcPr>
-            <w:tcW w:type="dxa" w:w="4320"/>
-          </w:tcPr>
-          <w:p>
-            <w:r>
-              <w:t>IAM ロール (GitHub Actions)</w:t>
-            </w:r>
-          </w:p>
-        </w:tc>
-        <w:tc>
-          <w:tcPr>
-            <w:tcW w:type="dxa" w:w="4320"/>
-          </w:tcPr>
-          <w:p>
-            <w:r>
-              <w:t>GitHubActionsRole-SimpleRAG</w:t>
-            </w:r>
-          </w:p>
-        </w:tc>
-      </w:tr>
-      <w:tr>
-        <w:tc>
-          <w:tcPr>
-            <w:tcW w:type="dxa" w:w="4320"/>
-          </w:tcPr>
-          <w:p>
-            <w:r>
-              <w:t>OIDC プロバイダー</w:t>
-            </w:r>
-          </w:p>
-        </w:tc>
-        <w:tc>
-          <w:tcPr>
-            <w:tcW w:type="dxa" w:w="4320"/>
-          </w:tcPr>
-          <w:p>
-            <w:r>
-              <w:t>token.actions.githubusercontent.com</w:t>
-            </w:r>
-          </w:p>
-        </w:tc>
-      </w:tr>
-    </w:tbl>
-    <w:p>
-      <w:pPr>
-        <w:pStyle w:val="Heading2"/>
-      </w:pPr>
-      <w:r>
-        <w:t>デプロイURL</w:t>
-      </w:r>
-    </w:p>
-    <w:p>
-      <w:r>
-        <w:t>https://si-aecae9ee619d4ec8938daaa28c992793.ecs.ap-northeast-1.on.aws</w:t>
-      </w:r>
-    </w:p>
-    <w:p>
-      <w:pPr>
-        <w:pStyle w:val="Heading1"/>
-      </w:pPr>
-      <w:r>
-        <w:t>開発中の課題と対応</w:t>
-      </w:r>
-    </w:p>
-    <w:tbl>
-      <w:tblPr>
-        <w:tblStyle w:val="LightGrid-Accent1"/>
-        <w:tblW w:type="auto" w:w="0"/>
-        <w:tblLook w:firstColumn="1" w:firstRow="1" w:lastColumn="0" w:lastRow="0" w:noHBand="0" w:noVBand="1" w:val="04A0"/>
-      </w:tblPr>
-      <w:tblGrid>
-        <w:gridCol w:w="2880"/>
-        <w:gridCol w:w="2880"/>
-        <w:gridCol w:w="2880"/>
-      </w:tblGrid>
-      <w:tr>
-        <w:tc>
-          <w:tcPr>
-            <w:tcW w:type="dxa" w:w="2880"/>
-          </w:tcPr>
-          <w:p>
-            <w:r>
-              <w:t>課題</w:t>
-            </w:r>
-          </w:p>
-        </w:tc>
-        <w:tc>
-          <w:tcPr>
-            <w:tcW w:type="dxa" w:w="2880"/>
-          </w:tcPr>
-          <w:p>
-            <w:r>
-              <w:t>原因</w:t>
-            </w:r>
-          </w:p>
-        </w:tc>
-        <w:tc>
-          <w:tcPr>
-            <w:tcW w:type="dxa" w:w="2880"/>
-          </w:tcPr>
-          <w:p>
-            <w:r>
-              <w:t>対応</w:t>
+              <w:t>セッションクリア</w:t>
             </w:r>
           </w:p>
         </w:tc>
@@ -1027,7 +1583,7 @@
           </w:tcPr>
           <w:p>
             <w:r>
-              <w:t>faiss-cpu インストール失敗</w:t>
+              <w:t>POST</w:t>
             </w:r>
           </w:p>
         </w:tc>
@@ -1037,7 +1593,7 @@
           </w:tcPr>
           <w:p>
             <w:r>
-              <w:t>Python 3.14 対応バージョンなし</w:t>
+              <w:t>/api/knowledge/save</w:t>
             </w:r>
           </w:p>
         </w:tc>
@@ -1047,7 +1603,7 @@
           </w:tcPr>
           <w:p>
             <w:r>
-              <w:t>バージョンを 1.14.2 に更新</w:t>
+              <w:t>ナレッジベース保存</w:t>
             </w:r>
           </w:p>
         </w:tc>
@@ -1059,7 +1615,7 @@
           </w:tcPr>
           <w:p>
             <w:r>
-              <w:t>numpy ビルド失敗</w:t>
+              <w:t>POST</w:t>
             </w:r>
           </w:p>
         </w:tc>
@@ -1069,7 +1625,7 @@
           </w:tcPr>
           <w:p>
             <w:r>
-              <w:t>Python 3.14 + Visual Studio未インストール</w:t>
+              <w:t>/api/knowledge/load</w:t>
             </w:r>
           </w:p>
         </w:tc>
@@ -1079,7 +1635,7 @@
           </w:tcPr>
           <w:p>
             <w:r>
-              <w:t>scikit-learn に切り替え</w:t>
+              <w:t>ナレッジベース読み込み</w:t>
             </w:r>
           </w:p>
         </w:tc>
@@ -1091,7 +1647,7 @@
           </w:tcPr>
           <w:p>
             <w:r>
-              <w:t>scikit-learn インストール停止</w:t>
+              <w:t>POST</w:t>
             </w:r>
           </w:p>
         </w:tc>
@@ -1101,7 +1657,7 @@
           </w:tcPr>
           <w:p>
             <w:r>
-              <w:t>Python 3.14 用 wheel なし</w:t>
+              <w:t>/api/knowledge/append</w:t>
             </w:r>
           </w:p>
         </w:tc>
@@ -1111,7 +1667,7 @@
           </w:tcPr>
           <w:p>
             <w:r>
-              <w:t>Pure Python実装に切り替え</w:t>
+              <w:t>ナレッジベースに追加</w:t>
             </w:r>
           </w:p>
         </w:tc>
@@ -1123,7 +1679,7 @@
           </w:tcPr>
           <w:p>
             <w:r>
-              <w:t>sentence-transformers メモリエラー</w:t>
+              <w:t>GET</w:t>
             </w:r>
           </w:p>
         </w:tc>
@@ -1133,7 +1689,7 @@
           </w:tcPr>
           <w:p>
             <w:r>
-              <w:t>Python 3.14 と Rust バインディング互換性問題</w:t>
+              <w:t>/api/knowledge/list</w:t>
             </w:r>
           </w:p>
         </w:tc>
@@ -1143,7 +1699,7 @@
           </w:tcPr>
           <w:p>
             <w:r>
-              <w:t>TF-IDF (Pure Python) に変更</w:t>
+              <w:t>ナレッジベース一覧</w:t>
             </w:r>
           </w:p>
         </w:tc>
@@ -1155,7 +1711,7 @@
           </w:tcPr>
           <w:p>
             <w:r>
-              <w:t>Claude API 404エラー</w:t>
+              <w:t>DELETE</w:t>
             </w:r>
           </w:p>
         </w:tc>
@@ -1165,7 +1721,7 @@
           </w:tcPr>
           <w:p>
             <w:r>
-              <w:t>モデルID が無効</w:t>
+              <w:t>/api/knowledge/{name}</w:t>
             </w:r>
           </w:p>
         </w:tc>
@@ -1175,7 +1731,7 @@
           </w:tcPr>
           <w:p>
             <w:r>
-              <w:t>claude-sonnet-4-6 に修正</w:t>
+              <w:t>ナレッジベース削除</w:t>
             </w:r>
           </w:p>
         </w:tc>
@@ -1187,7 +1743,7 @@
           </w:tcPr>
           <w:p>
             <w:r>
-              <w:t>pip install 固まる</w:t>
+              <w:t>POST</w:t>
             </w:r>
           </w:p>
         </w:tc>
@@ -1197,7 +1753,7 @@
           </w:tcPr>
           <w:p>
             <w:r>
-              <w:t>前回の強制終了によるキャッシュ破損</w:t>
+              <w:t>/api/export/word</w:t>
             </w:r>
           </w:p>
         </w:tc>
@@ -1207,103 +1763,7 @@
           </w:tcPr>
           <w:p>
             <w:r>
-              <w:t>pip cache purge で解決</w:t>
-            </w:r>
-          </w:p>
-        </w:tc>
-      </w:tr>
-      <w:tr>
-        <w:tc>
-          <w:tcPr>
-            <w:tcW w:type="dxa" w:w="2880"/>
-          </w:tcPr>
-          <w:p>
-            <w:r>
-              <w:t>GitHub Actions OIDC失敗</w:t>
-            </w:r>
-          </w:p>
-        </w:tc>
-        <w:tc>
-          <w:tcPr>
-            <w:tcW w:type="dxa" w:w="2880"/>
-          </w:tcPr>
-          <w:p>
-            <w:r>
-              <w:t>AWSアカウントIDの誤り</w:t>
-            </w:r>
-          </w:p>
-        </w:tc>
-        <w:tc>
-          <w:tcPr>
-            <w:tcW w:type="dxa" w:w="2880"/>
-          </w:tcPr>
-          <w:p>
-            <w:r>
-              <w:t>正しいID に修正</w:t>
-            </w:r>
-          </w:p>
-        </w:tc>
-      </w:tr>
-      <w:tr>
-        <w:tc>
-          <w:tcPr>
-            <w:tcW w:type="dxa" w:w="2880"/>
-          </w:tcPr>
-          <w:p>
-            <w:r>
-              <w:t>ECS CPU/Memory エラー</w:t>
-            </w:r>
-          </w:p>
-        </w:tc>
-        <w:tc>
-          <w:tcPr>
-            <w:tcW w:type="dxa" w:w="2880"/>
-          </w:tcPr>
-          <w:p>
-            <w:r>
-              <w:t>値の単位が不正</w:t>
-            </w:r>
-          </w:p>
-        </w:tc>
-        <w:tc>
-          <w:tcPr>
-            <w:tcW w:type="dxa" w:w="2880"/>
-          </w:tcPr>
-          <w:p>
-            <w:r>
-              <w:t>Fargate互換の値に修正</w:t>
-            </w:r>
-          </w:p>
-        </w:tc>
-      </w:tr>
-      <w:tr>
-        <w:tc>
-          <w:tcPr>
-            <w:tcW w:type="dxa" w:w="2880"/>
-          </w:tcPr>
-          <w:p>
-            <w:r>
-              <w:t>ECS サービスリンクロール不在</w:t>
-            </w:r>
-          </w:p>
-        </w:tc>
-        <w:tc>
-          <w:tcPr>
-            <w:tcW w:type="dxa" w:w="2880"/>
-          </w:tcPr>
-          <w:p>
-            <w:r>
-              <w:t>初回ECS利用時に必要</w:t>
-            </w:r>
-          </w:p>
-        </w:tc>
-        <w:tc>
-          <w:tcPr>
-            <w:tcW w:type="dxa" w:w="2880"/>
-          </w:tcPr>
-          <w:p>
-            <w:r>
-              <w:t>create-service-linked-role で作成</w:t>
+              <w:t>チャット履歴エクスポート</w:t>
             </w:r>
           </w:p>
         </w:tc>
@@ -1314,28 +1774,7 @@
         <w:pStyle w:val="Heading1"/>
       </w:pPr>
       <w:r>
-        <w:t>設計判断</w:t>
-      </w:r>
-    </w:p>
-    <w:p>
-      <w:pPr>
-        <w:pStyle w:val="Heading2"/>
-      </w:pPr>
-      <w:r>
-        <w:t>TF-IDF を採用した理由</w:t>
-      </w:r>
-    </w:p>
-    <w:p>
-      <w:r>
-        <w:t>当初は sentence-transformers + FAISS によるセマンティック検索を予定していたが、Python 3.14 環境での互換性問題により、外部依存のない Pure Python 実装の TF-IDF に変更。文字 n-gram (2〜4文字) を使用することで、日本語テキストにも対応。</w:t>
-      </w:r>
-    </w:p>
-    <w:p>
-      <w:pPr>
-        <w:pStyle w:val="Heading2"/>
-      </w:pPr>
-      <w:r>
-        <w:t>ECS Express Mode を採用した理由</w:t>
+        <w:t>9. セキュリティ</w:t>
       </w:r>
     </w:p>
     <w:p>
@@ -1343,7 +1782,7 @@
         <w:pStyle w:val="ListBullet"/>
       </w:pPr>
       <w:r>
-        <w:t>AWS App Runner が2026年4月30日以降新規利用不可</w:t>
+        <w:t>Cognito によるユーザー認証（メール + パスワード）</w:t>
       </w:r>
     </w:p>
     <w:p>
@@ -1351,7 +1790,7 @@
         <w:pStyle w:val="ListBullet"/>
       </w:pPr>
       <w:r>
-        <w:t>ECS Express Mode は App Runner の後継として推奨</w:t>
+        <w:t>GitHub OIDC による CI/CD 認証（長期キー不使用）</w:t>
       </w:r>
     </w:p>
     <w:p>
@@ -1359,7 +1798,7 @@
         <w:pStyle w:val="ListBullet"/>
       </w:pPr>
       <w:r>
-        <w:t>インフラ管理が自動化され、URL発行・SSL・オートスケーリングが標準装備</w:t>
+        <w:t>ECS Task Role による最小権限の原則（Bedrock, S3, Cognito のみ）</w:t>
       </w:r>
     </w:p>
     <w:p>
@@ -1367,7 +1806,23 @@
         <w:pStyle w:val="ListBullet"/>
       </w:pPr>
       <w:r>
-        <w:t>Docker ローカルインストール不要（GitHub Actions でビルド）</w:t>
+        <w:t>HTTPS 自動（ALB + ACM）</w:t>
+      </w:r>
+    </w:p>
+    <w:p>
+      <w:pPr>
+        <w:pStyle w:val="ListBullet"/>
+      </w:pPr>
+      <w:r>
+        <w:t>API キーは環境変数で管理（コードに含めない）</w:t>
+      </w:r>
+    </w:p>
+    <w:p>
+      <w:pPr>
+        <w:pStyle w:val="ListBullet"/>
+      </w:pPr>
+      <w:r>
+        <w:t>GitHub Push Protection によるシークレット漏洩防止</w:t>
       </w:r>
     </w:p>
     <w:p>
@@ -1375,43 +1830,37 @@
         <w:pStyle w:val="Heading1"/>
       </w:pPr>
       <w:r>
-        <w:t>今後の改善案</w:t>
+        <w:t>10. 今後の改善案</w:t>
       </w:r>
     </w:p>
     <w:p>
       <w:r>
-        <w:t>1. 検索精度向上: Amazon Bedrock Titan Embeddings を使ったセマンティック検索への移行</w:t>
+        <w:t>1. 社内AD連携（Azure AD / ADFS との SAML/OIDC 連携）</w:t>
       </w:r>
     </w:p>
     <w:p>
       <w:r>
-        <w:t>2. 永続化: アップロードデータのS3保存 + ベクトルインデックスの永続化</w:t>
+        <w:t>2. ナレッジベースのアクセス制御（部署ごとの権限管理）</w:t>
       </w:r>
     </w:p>
     <w:p>
       <w:r>
-        <w:t>3. 認証: Cognito による認証追加</w:t>
+        <w:t>3. ハイブリッド検索（セマンティック + キーワード完全一致の統合）</w:t>
       </w:r>
     </w:p>
     <w:p>
       <w:r>
-        <w:t>4. ファイル対応拡張: テキストファイル、Markdown、Excel 対応</w:t>
+        <w:t>4. 利用ログ・監査（誰がいつ何を質問したかの記録）</w:t>
       </w:r>
     </w:p>
     <w:p>
       <w:r>
-        <w:t>5. 会話履歴: マルチターン対話のサポート</w:t>
+        <w:t>5. 回答のストリーミング表示（Server-Sent Events）</w:t>
       </w:r>
     </w:p>
     <w:p>
       <w:r>
-        <w:t>6. コスト最適化: タスク数の最小値を0にしてスケールダウン</w:t>
-      </w:r>
-    </w:p>
-    <w:p/>
-    <w:p>
-      <w:r>
-        <w:t>作成日: 2026年5月29日</w:t>
+        <w:t>6. ファイルのOCR対応（スキャンPDFへの対応）</w:t>
       </w:r>
     </w:p>
     <w:sectPr>

</xml_diff>